<commit_message>
[BA]: sửa Report 2 theo review: R04 còn 15 feature, EX là Exception, thêm trạng thái Cancelled vào vòng đời Meeting, gỡ các [TBD] (mô hình AI theo ADR-0026, máy chủ theo ADR-0015), cập nhật mốc baseline Report 3, sửa mục lục (thêm Definition and Acronyms) và Change Log 30/10 (v1.2)
</commit_message>
<xml_diff>
--- a/docs/08-reports/source/Report_2_Project_Management_Plan.docx
+++ b/docs/08-reports/source/Report_2_Project_Management_Plan.docx
@@ -397,6 +397,80 @@
               <w14:ligatures w14:val="standardContextual"/>
             </w:rPr>
           </w:pPr>
+          <w:hyperlink w:anchor="_Toc242457627" w:history="1">
+            <w:r>
+              <w:rPr>
+                <w:rStyle w:val="Hyperlink"/>
+                <w:noProof/>
+              </w:rPr>
+              <w:t>Definition and Acronyms</w:t>
+            </w:r>
+            <w:r>
+              <w:rPr>
+                <w:noProof/>
+                <w:webHidden/>
+              </w:rPr>
+              <w:tab/>
+            </w:r>
+            <w:r>
+              <w:rPr>
+                <w:noProof/>
+                <w:webHidden/>
+              </w:rPr>
+              <w:fldChar w:fldCharType="begin"/>
+            </w:r>
+            <w:r>
+              <w:rPr>
+                <w:noProof/>
+                <w:webHidden/>
+              </w:rPr>
+              <w:instrText xml:space="preserve"> PAGEREF _Toc242457627 \h </w:instrText>
+            </w:r>
+            <w:r>
+              <w:rPr>
+                <w:noProof/>
+                <w:webHidden/>
+              </w:rPr>
+            </w:r>
+            <w:r>
+              <w:rPr>
+                <w:noProof/>
+                <w:webHidden/>
+              </w:rPr>
+              <w:fldChar w:fldCharType="separate"/>
+            </w:r>
+            <w:r>
+              <w:rPr>
+                <w:noProof/>
+                <w:webHidden/>
+              </w:rPr>
+              <w:t>4</w:t>
+            </w:r>
+            <w:r>
+              <w:rPr>
+                <w:noProof/>
+                <w:webHidden/>
+              </w:rPr>
+              <w:fldChar w:fldCharType="end"/>
+            </w:r>
+          </w:hyperlink>
+        </w:p>
+        <w:p>
+          <w:pPr>
+            <w:pStyle w:val="TOC1"/>
+            <w:tabs>
+              <w:tab w:val="right" w:leader="dot" w:pos="9040"/>
+            </w:tabs>
+            <w:rPr>
+              <w:rFonts w:asciiTheme="minorHAnsi" w:eastAsiaTheme="minorEastAsia" w:hAnsiTheme="minorHAnsi" w:cstheme="minorBidi"/>
+              <w:noProof/>
+              <w:kern w:val="2"/>
+              <w:sz w:val="24"/>
+              <w:szCs w:val="24"/>
+              <w:lang w:eastAsia="en-US" w:bidi="ar-SA"/>
+              <w14:ligatures w14:val="standardContextual"/>
+            </w:rPr>
+          </w:pPr>
           <w:hyperlink w:anchor="_Toc242459623" w:history="1">
             <w:r>
               <w:rPr>
@@ -2697,6 +2771,60 @@
           </w:p>
         </w:tc>
       </w:tr>
+      <w:tr>
+        <w:tc>
+          <w:tcPr>
+            <w:tcW w:w="1275" w:type="dxa"/>
+          </w:tcPr>
+          <w:p>
+            <w:pPr>
+              <w:pStyle w:val="normal1"/>
+            </w:pPr>
+            <w:r>
+              <w:t>30/10/2026</w:t>
+            </w:r>
+          </w:p>
+        </w:tc>
+        <w:tc>
+          <w:tcPr>
+            <w:tcW w:w="750" w:type="dxa"/>
+          </w:tcPr>
+          <w:p>
+            <w:pPr>
+              <w:pStyle w:val="normal1"/>
+            </w:pPr>
+            <w:r>
+              <w:t>M</w:t>
+            </w:r>
+          </w:p>
+        </w:tc>
+        <w:tc>
+          <w:tcPr>
+            <w:tcW w:w="1275" w:type="dxa"/>
+          </w:tcPr>
+          <w:p>
+            <w:pPr>
+              <w:pStyle w:val="normal1"/>
+            </w:pPr>
+            <w:r>
+              <w:t>HuyNQ</w:t>
+            </w:r>
+          </w:p>
+        </w:tc>
+        <w:tc>
+          <w:tcPr>
+            <w:tcW w:w="5505" w:type="dxa"/>
+          </w:tcPr>
+          <w:p>
+            <w:pPr>
+              <w:pStyle w:val="normal1"/>
+            </w:pPr>
+            <w:r>
+              <w:t>Project Management Plan v1.2: Fix review findings - Fifteen features in risk R04, EX defined as Exception as in Report 3, add Cancelled to the Meeting lifecycle, close the [TBD] items (AI model environment per ADR-0026, deployment server per ADR-0015), align the Report 3 baseline reference with its 29/10/2026 Change Log, and fix the Table of Contents (add Definition and Acronyms, point I. Project Overview to its own heading).</w:t>
+            </w:r>
+          </w:p>
+        </w:tc>
+      </w:tr>
     </w:tbl>
     <w:p>
       <w:pPr>
@@ -2735,7 +2863,6 @@
         <w:pStyle w:val="Heading1"/>
       </w:pPr>
       <w:bookmarkStart w:id="1" w:name="_Toc242457627"/>
-      <w:bookmarkStart w:id="2" w:name="_Toc242459623"/>
       <w:r>
         <w:lastRenderedPageBreak/>
         <w:t>Definition and Acronyms</w:t>
@@ -2988,7 +3115,7 @@
                 <w:sz w:val="24"/>
                 <w:szCs w:val="24"/>
               </w:rPr>
-              <w:t>Exclusion</w:t>
+              <w:t>Exception</w:t>
             </w:r>
           </w:p>
         </w:tc>
@@ -3002,6 +3129,7 @@
           <w:szCs w:val="46"/>
         </w:rPr>
       </w:pPr>
+      <w:bookmarkStart w:id="2" w:name="_Toc242459623"/>
       <w:r>
         <w:rPr>
           <w:sz w:val="46"/>
@@ -3043,7 +3171,7 @@
           <w:sz w:val="24"/>
           <w:szCs w:val="24"/>
         </w:rPr>
-        <w:t>This Project Management Plan defines how group SEP490-G116 organises, executes, monitors and controls the development of TrustCabinet for TrustSoft over the fifteen-week capstone period from 14 September 2026 to 27 December 2026. It establishes the work packages, committed effort and schedule, quality objectives, responsibilities, communication and configuration practices. The product scope is aligned with Report 1 and the latest Report 3 SRS Revised v4 baseline dated 09/10/2026. Later scope changes require the established change-control process and a Change Log entry.</w:t>
+        <w:t>This Project Management Plan defines how group SEP490-G116 organises, executes, monitors and controls the development of TrustCabinet for TrustSoft over the fifteen-week capstone period from 14 September 2026 to 27 December 2026. It establishes the work packages, committed effort and schedule, quality objectives, responsibilities, communication and configuration practices. The product scope is aligned with Report 1 and the latest Report 3 SRS baseline (Change Log of 29/10/2026). Later scope changes require the established change-control process and a Change Log entry.</w:t>
       </w:r>
     </w:p>
     <w:p>
@@ -4151,10 +4279,10 @@
               <w:ind w:left="140"/>
             </w:pPr>
             <w:r>
-              <w:t xml:space="preserve">The technology stack is fixed in the source code repository: ASP.NET Core 10 (C#) for the backend, React 19 with TypeScript and Vite for the frontend, PostgreSQL 17 through Entity Framework Core 10 as the database and Redis for refresh tokens (Section II.6.3). The environment in which the speech-processing and summarisation model runs is not yet fixed. </w:t>
-            </w:r>
-            <w:r>
-              <w:t>[TBD - to be confirmed before Iteration 3]</w:t>
+              <w:t xml:space="preserve">The technology stack is fixed in the source code repository: ASP.NET Core 10 (C#) for the backend, React 19 with TypeScript and Vite for the frontend, PostgreSQL 17 through Entity Framework Core 10 as the database and Redis for refresh tokens (Section II.6.3). The speech-processing and summarisation model runs in-house in a separate CPU-only worker (ADR-0026, decided by the Product Owner on 23/10/2026). </w:t>
+            </w:r>
+            <w:r>
+              <w:t xml:space="preserve"> </w:t>
             </w:r>
           </w:p>
         </w:tc>
@@ -4216,7 +4344,7 @@
         <w:jc w:val="both"/>
       </w:pPr>
       <w:r>
-        <w:t>Effort is expressed in eight-hour person-days (pds). The 210 pds committed below are the effective working capacity derived in Section I.4; the 52.5 pds buffer remains unallocated. The total retains 14 pds for initial planning and 28 pds for each of six iterations and the deployment phase. The fifteen active features are FE-01 through FE-15, aligned with Report 3 SRS Revised v4. Consolidating the Meeting lifecycle and narrowing voting changes work-package content; the committed effort, iteration dates and closing milestone remain unchanged.</w:t>
+        <w:t>Effort is expressed in eight-hour person-days (pds). The 210 pds committed below are the effective working capacity derived in Section I.4; the 52.5 pds buffer remains unallocated. The total retains 14 pds for initial planning and 28 pds for each of six iterations and the deployment phase. The fifteen active features are FE-01 through FE-15, aligned with the Report 3 SRS baseline of 29/10/2026. Consolidating the Meeting lifecycle and narrowing voting changes work-package content; the committed effort, iteration dates and closing milestone remain unchanged.</w:t>
       </w:r>
     </w:p>
     <w:tbl>
@@ -11366,7 +11494,7 @@
               </w:rPr>
             </w:pPr>
             <w:r>
-              <w:t>The environment in which the speech-processing and summarisation model runs is still open at the time of writing: the application stack is fixed (Section II.6.3), but the code base does not yet contain any speech-processing component. This delays the analysis and design of the audio-processing pipeline in Iteration 3. [TBD - to be confirmed before Iteration 3]</w:t>
+              <w:t>The environment in which the speech-processing and summarisation model runs was open when this plan was first written. The Product Owner decided on 23/10/2026 (ADR-0026) that it runs in-house in a separate CPU-only worker, so the remaining risk is the capacity of the deployment server, which is a 1 GB instance today and will move to a larger one.</w:t>
             </w:r>
           </w:p>
         </w:tc>
@@ -11444,7 +11572,7 @@
               <w:ind w:left="140"/>
             </w:pPr>
             <w:r>
-              <w:t>Sixteen features in fifteen weeks exceeds what five part-time members can build, because every member carries other courses in parallel. The risk surfaces late, as unfinished work carried from one iteration to the next.</w:t>
+              <w:t>Fifteen features in fifteen weeks exceeds what five part-time members can build, because every member carries other courses in parallel. The risk surfaces late, as unfinished work carried from one iteration to the next.</w:t>
             </w:r>
           </w:p>
         </w:tc>
@@ -12821,7 +12949,7 @@
         <w:jc w:val="both"/>
       </w:pPr>
       <w:r>
-        <w:t>●  Requirements - Elaborate one independent Meeting with planned schedule and lifecycle Draft, WaitingApproval, Rejected, Approved, Published, InProgress and Ended; the assigned approver reviews submission, the Organizer publishes after approval, and the Chair starts and ends execution. There is no Meeting Session layer. Define Secretary agenda preparation and participant/Guest coordination, invitation responses and official attendance. Agenda planning is allowed through InProgress and prohibited after Ended; Chair execution actions remain separate. Define the personal document library, two-source meeting attachments, versioning, preview, comments and notification events. Recorded as Report 3 SRS v1.0 with the latest approved baseline applied.</w:t>
+        <w:t>●  Requirements - Elaborate one independent Meeting with planned schedule and lifecycle Draft, WaitingApproval, Rejected, Approved, Published, InProgress and Ended, with Cancelled for a Meeting that will not take place; the assigned approver reviews submission, the Organizer publishes after approval, and the Chair starts and ends execution. There is no Meeting Session layer. Define Secretary agenda preparation and participant/Guest coordination, invitation responses and official attendance. Agenda planning is allowed through InProgress and prohibited after Ended; Chair execution actions remain separate. Define the personal document library, two-source meeting attachments, versioning, preview, comments and notification events. Recorded as Report 3 SRS v1.0 with the latest approved baseline applied.</w:t>
       </w:r>
       <w:r>
         <w:tab/>
@@ -21666,7 +21794,7 @@
               </w:rPr>
             </w:pPr>
             <w:r>
-              <w:t>Post-meeting Vietnamese transcription with speaker attribution and reviewed summaries. Processing environment to be confirmed before Iteration 3: either a self-hosted model service or an external AI/ASR API behind a replaceable interface. Record the provider/model per result; implement consent, retention and erasure safeguards and prohibit provider retention or reuse.</w:t>
+              <w:t>Post-meeting Vietnamese transcription with speaker attribution and reviewed summaries. Processing environment: self-hosted in an internal CPU-only speech worker (ADR-0026, 23/10/2026), behind a replaceable interface. Record the provider/model per result; implement consent, retention and erasure safeguards and prohibit provider retention or reuse.</w:t>
             </w:r>
           </w:p>
         </w:tc>
@@ -21957,7 +22085,7 @@
               </w:rPr>
             </w:pPr>
             <w:r>
-              <w:t>[TBD - to be confirmed once the deployment environment is decided]</w:t>
+              <w:t>AWS Lightsail instance running Docker Compose behind Caddy (ADR-0015); to be moved to a larger instance for the speech worker (ADR-0026).</w:t>
             </w:r>
           </w:p>
         </w:tc>

</xml_diff>

<commit_message>
[BA]: sửa Report 2 và 3 theo review PR #204: AI/Speech là worker nội bộ (4.1, I.1, 17.6), LiveKit chuyển sang Built (5.2, 17.4, 17.5), bổ sung Change Log 30/10 và khôi phục hai dòng Change Log cũ (ADR-0034/0035, as in AI-eCabinet), viết lại Mitigation R03 và hạ Probability xuống Low, bỏ 'versioning' ở Iteration 2, khôi phục font nhúng của DOCX Report 3 từ main
</commit_message>
<xml_diff>
--- a/docs/08-reports/source/Report_2_Project_Management_Plan.docx
+++ b/docs/08-reports/source/Report_2_Project_Management_Plan.docx
@@ -2820,7 +2820,7 @@
               <w:pStyle w:val="normal1"/>
             </w:pPr>
             <w:r>
-              <w:t>Project Management Plan v1.2: Fix review findings - Fifteen features in risk R04, EX defined as Exception as in Report 3, add Cancelled to the Meeting lifecycle, close the [TBD] items (AI model environment per ADR-0026, deployment server per ADR-0015), align the Report 3 baseline reference with its 29/10/2026 Change Log, and fix the Table of Contents (add Definition and Acronyms, point I. Project Overview to its own heading).</w:t>
+              <w:t>Project Management Plan v1.2: Fix review findings - Fifteen features in risk R04, EX defined as Exception as in Report 3, add Cancelled to the Meeting lifecycle, close the [TBD] items (AI model environment per ADR-0026, deployment server per ADR-0015), rewrite the R03 mitigation and lower its probability to Low now that the model host is decided, remove "versioning" from Iteration 2 (ADR-0018), align the Report 3 baseline reference with its 29/10/2026 Change Log, and fix the Table of Contents (add Definition and Acronyms, point I. Project Overview to its own heading).</w:t>
             </w:r>
           </w:p>
         </w:tc>
@@ -11509,7 +11509,7 @@
               <w:jc w:val="center"/>
             </w:pPr>
             <w:r>
-              <w:t>Medium</w:t>
+              <w:t>Low</w:t>
             </w:r>
           </w:p>
         </w:tc>
@@ -11538,7 +11538,7 @@
               <w:ind w:left="140"/>
             </w:pPr>
             <w:r>
-              <w:t>Set the decision deadline at the end of Iteration 2, before the requirements phase of Iteration 3. Design the architecture so that transcription and summarisation sit behind an internal interface and can be switched between a self-hosted model and an external service without changing the rest of the system. Update this plan and Section II.6.3 as soon as the decision is taken.</w:t>
+              <w:t xml:space="preserve">Move the deployment server to a 4 GB instance, or run the speech worker on a team machine that the server reaches over a private network connection (see the deployment guide). The application keeps working while the worker is off, and the functions that need it report MSG312. Keep transcription and summarisation behind an internal interface so the worker can change host without changing the rest of the system. Update Section II.6.3 when the host is fixed.</w:t>
             </w:r>
           </w:p>
         </w:tc>
@@ -12949,7 +12949,7 @@
         <w:jc w:val="both"/>
       </w:pPr>
       <w:r>
-        <w:t>●  Requirements - Elaborate one independent Meeting with planned schedule and lifecycle Draft, WaitingApproval, Rejected, Approved, Published, InProgress and Ended, with Cancelled for a Meeting that will not take place; the assigned approver reviews submission, the Organizer publishes after approval, and the Chair starts and ends execution. There is no Meeting Session layer. Define Secretary agenda preparation and participant/Guest coordination, invitation responses and official attendance. Agenda planning is allowed through InProgress and prohibited after Ended; Chair execution actions remain separate. Define the personal document library, two-source meeting attachments, versioning, preview, comments and notification events. Recorded as Report 3 SRS v1.0 with the latest approved baseline applied.</w:t>
+        <w:t>●  Requirements - Elaborate one independent Meeting with planned schedule and lifecycle Draft, WaitingApproval, Rejected, Approved, Published, InProgress and Ended, with Cancelled for a Meeting that will not take place; the assigned approver reviews submission, the Organizer publishes after approval, and the Chair starts and ends execution. There is no Meeting Session layer. Define Secretary agenda preparation and participant/Guest coordination, invitation responses and official attendance. Agenda planning is allowed through InProgress and prohibited after Ended; Chair execution actions remain separate. Define the personal document library, two-source meeting attachments, preview, comments and notification events. Recorded as Report 3 SRS v1.0 with the latest approved baseline applied.</w:t>
       </w:r>
       <w:r>
         <w:tab/>

</xml_diff>